<commit_message>
Fix souscripteurs: placeholders siege_social/capital/adresse/date_naissance/ville_signature + remplacements nb_actions
</commit_message>
<xml_diff>
--- a/templates/sasu/souscripteurs.docx
+++ b/templates/sasu/souscripteurs.docx
@@ -1,761 +1,6 @@
 
-<file path=word/document.xml><?xml version="1.0" encoding="utf-8"?>
-<w:document xmlns:wpc="http://schemas.microsoft.com/office/word/2010/wordprocessingCanvas" xmlns:cx="http://schemas.microsoft.com/office/drawing/2014/chartex" xmlns:cx1="http://schemas.microsoft.com/office/drawing/2015/9/8/chartex" xmlns:cx2="http://schemas.microsoft.com/office/drawing/2015/10/21/chartex" xmlns:cx3="http://schemas.microsoft.com/office/drawing/2016/5/9/chartex" xmlns:cx4="http://schemas.microsoft.com/office/drawing/2016/5/10/chartex" xmlns:cx5="http://schemas.microsoft.com/office/drawing/2016/5/11/chartex" xmlns:cx6="http://schemas.microsoft.com/office/drawing/2016/5/12/chartex" xmlns:cx7="http://schemas.microsoft.com/office/drawing/2016/5/13/chartex" xmlns:cx8="http://schemas.microsoft.com/office/drawing/2016/5/14/chartex" xmlns:mc="http://schemas.openxmlformats.org/markup-compatibility/2006" xmlns:aink="http://schemas.microsoft.com/office/drawing/2016/ink" xmlns:am3d="http://schemas.microsoft.com/office/drawing/2017/model3d" xmlns:o="urn:schemas-microsoft-com:office:office" xmlns:oel="http://schemas.microsoft.com/office/2019/extlst" xmlns:r="http://schemas.openxmlformats.org/officeDocument/2006/relationships" xmlns:m="http://schemas.openxmlformats.org/officeDocument/2006/math" xmlns:v="urn:schemas-microsoft-com:vml" xmlns:wp14="http://schemas.microsoft.com/office/word/2010/wordprocessingDrawing" xmlns:wp="http://schemas.openxmlformats.org/drawingml/2006/wordprocessingDrawing" xmlns:w10="urn:schemas-microsoft-com:office:word" xmlns:w="http://schemas.openxmlformats.org/wordprocessingml/2006/main" xmlns:w14="http://schemas.microsoft.com/office/word/2010/wordml" xmlns:w15="http://schemas.microsoft.com/office/word/2012/wordml" xmlns:w16cex="http://schemas.microsoft.com/office/word/2018/wordml/cex" xmlns:w16cid="http://schemas.microsoft.com/office/word/2016/wordml/cid" xmlns:w16="http://schemas.microsoft.com/office/word/2018/wordml" xmlns:w16du="http://schemas.microsoft.com/office/word/2023/wordml/word16du" xmlns:w16sdtdh="http://schemas.microsoft.com/office/word/2020/wordml/sdtdatahash" xmlns:w16sdtfl="http://schemas.microsoft.com/office/word/2024/wordml/sdtformatlock" xmlns:w16se="http://schemas.microsoft.com/office/word/2015/wordml/symex" xmlns:wpg="http://schemas.microsoft.com/office/word/2010/wordprocessingGroup" xmlns:wpi="http://schemas.microsoft.com/office/word/2010/wordprocessingInk" xmlns:wne="http://schemas.microsoft.com/office/word/2006/wordml" xmlns:wps="http://schemas.microsoft.com/office/word/2010/wordprocessingShape" mc:Ignorable="w14 w15 w16se w16cid w16 w16cex w16sdtdh w16sdtfl w16du wp14">
-  <w:body>
-    <w:p>
-      <w:pPr>
-        <w:pStyle w:val="En-teteSteActe3"/>
-        <w:rPr>
-          <w:szCs w:val="22"/>
-        </w:rPr>
-      </w:pPr>
-      <w:r>
-        <w:rPr>
-          <w:szCs w:val="22"/>
-        </w:rPr>
-        <w:t xml:space="preserve">S.A.S.U </w:t>
-      </w:r>
-      <w:r>
-        <w:rPr>
-          <w:szCs w:val="22"/>
-        </w:rPr>
-        <w:t>{denomination}</w:t>
-      </w:r>
-      <w:r>
-        <w:rPr>
-          <w:szCs w:val="22"/>
-        </w:rPr>
-        <w:t xml:space="preserve"> </w:t>
-      </w:r>
-      <w:r>
-        <w:rPr>
-          <w:szCs w:val="22"/>
-        </w:rPr>
-        <w:t xml:space="preserve"> </w:t>
-      </w:r>
-    </w:p>
-    <w:p>
-      <w:pPr>
-        <w:pStyle w:val="En-teteSteActe3"/>
-        <w:rPr>
-          <w:szCs w:val="22"/>
-        </w:rPr>
-      </w:pPr>
-      <w:r>
-        <w:rPr>
-          <w:szCs w:val="22"/>
-        </w:rPr>
-        <w:t xml:space="preserve">au capital de </w:t>
-      </w:r>
-      <w:r>
-        <w:rPr>
-          <w:szCs w:val="22"/>
-        </w:rPr>
-        <w:t>1</w:t>
-      </w:r>
-      <w:r>
-        <w:rPr>
-          <w:szCs w:val="22"/>
-        </w:rPr>
-        <w:t>0</w:t>
-      </w:r>
-      <w:r>
-        <w:rPr>
-          <w:szCs w:val="22"/>
-        </w:rPr>
-        <w:t>0 Euros</w:t>
-      </w:r>
-    </w:p>
-    <w:p>
-      <w:pPr>
-        <w:pStyle w:val="En-teteSteActe3"/>
-        <w:rPr>
-          <w:sz w:val="24"/>
-          <w:szCs w:val="24"/>
-        </w:rPr>
-      </w:pPr>
-      <w:r>
-        <w:rPr>
-          <w:szCs w:val="22"/>
-        </w:rPr>
-        <w:t xml:space="preserve">Siège social : </w:t>
-      </w:r>
-      <w:bookmarkStart w:id="0" w:name="_Hlk120783997"/>
-      <w:r>
-        <w:rPr>
-          <w:sz w:val="24"/>
-          <w:szCs w:val="24"/>
-        </w:rPr>
-        <w:t xml:space="preserve">135 Avenue de Flandre </w:t>
-      </w:r>
-    </w:p>
-    <w:p>
-      <w:pPr>
-        <w:pStyle w:val="En-teteSteActe3"/>
-        <w:rPr>
-          <w:sz w:val="24"/>
-          <w:szCs w:val="24"/>
-        </w:rPr>
-      </w:pPr>
-      <w:r>
-        <w:rPr>
-          <w:sz w:val="24"/>
-          <w:szCs w:val="24"/>
-        </w:rPr>
-        <w:t>75019 Paris</w:t>
-      </w:r>
-    </w:p>
-    <w:bookmarkEnd w:id="0"/>
-    <w:p>
-      <w:pPr>
-        <w:pStyle w:val="En-teteSteActe3"/>
-      </w:pPr>
-      <w:r>
-        <w:t>Société en cours de constitution</w:t>
-      </w:r>
-    </w:p>
-    <w:tbl>
-      <w:tblPr>
-        <w:tblpPr w:leftFromText="141" w:rightFromText="141" w:vertAnchor="text" w:horzAnchor="margin" w:tblpXSpec="center" w:tblpY="2244"/>
-        <w:tblW w:w="9887" w:type="dxa"/>
-        <w:tblBorders>
-          <w:top w:val="single" w:sz="8" w:space="0" w:color="auto"/>
-          <w:left w:val="single" w:sz="8" w:space="0" w:color="auto"/>
-          <w:bottom w:val="single" w:sz="8" w:space="0" w:color="auto"/>
-          <w:right w:val="single" w:sz="8" w:space="0" w:color="auto"/>
-        </w:tblBorders>
-        <w:tblLayout w:type="fixed"/>
-        <w:tblLook w:val="04A0" w:firstRow="1" w:lastRow="0" w:firstColumn="1" w:lastColumn="0" w:noHBand="0" w:noVBand="1"/>
-      </w:tblPr>
-      <w:tblGrid>
-        <w:gridCol w:w="3676"/>
-        <w:gridCol w:w="1817"/>
-        <w:gridCol w:w="2197"/>
-        <w:gridCol w:w="2197"/>
-      </w:tblGrid>
-      <w:tr>
-        <w:trPr>
-          <w:trHeight w:val="973"/>
-          <w:tblHeader/>
-        </w:trPr>
-        <w:tc>
-          <w:tcPr>
-            <w:tcW w:w="3676" w:type="dxa"/>
-            <w:tcBorders>
-              <w:top w:val="single" w:sz="8" w:space="0" w:color="000000"/>
-              <w:left w:val="single" w:sz="8" w:space="0" w:color="000000"/>
-              <w:bottom w:val="single" w:sz="8" w:space="0" w:color="000000"/>
-              <w:right w:val="single" w:sz="8" w:space="0" w:color="000000"/>
-            </w:tcBorders>
-            <w:vAlign w:val="center"/>
-          </w:tcPr>
-          <w:p>
-            <w:pPr>
-              <w:pStyle w:val="EFLcellule"/>
-              <w:jc w:val="left"/>
-            </w:pPr>
-            <w:r>
-              <w:rPr>
-                <w:rStyle w:val="EFLmotgras"/>
-              </w:rPr>
-              <w:t>Identité ou désignation des Souscripteurs</w:t>
-            </w:r>
-          </w:p>
-        </w:tc>
-        <w:tc>
-          <w:tcPr>
-            <w:tcW w:w="1817" w:type="dxa"/>
-            <w:tcBorders>
-              <w:top w:val="single" w:sz="8" w:space="0" w:color="000000"/>
-              <w:left w:val="single" w:sz="8" w:space="0" w:color="000000"/>
-              <w:bottom w:val="single" w:sz="8" w:space="0" w:color="000000"/>
-              <w:right w:val="single" w:sz="8" w:space="0" w:color="000000"/>
-            </w:tcBorders>
-            <w:vAlign w:val="center"/>
-          </w:tcPr>
-          <w:p>
-            <w:pPr>
-              <w:pStyle w:val="EFLcellule"/>
-            </w:pPr>
-            <w:r>
-              <w:rPr>
-                <w:rStyle w:val="EFLmotgras"/>
-              </w:rPr>
-              <w:t>Nombre d'actions souscrites</w:t>
-            </w:r>
-          </w:p>
-        </w:tc>
-        <w:tc>
-          <w:tcPr>
-            <w:tcW w:w="2197" w:type="dxa"/>
-            <w:tcBorders>
-              <w:top w:val="single" w:sz="8" w:space="0" w:color="000000"/>
-              <w:left w:val="single" w:sz="8" w:space="0" w:color="000000"/>
-              <w:bottom w:val="single" w:sz="8" w:space="0" w:color="000000"/>
-              <w:right w:val="single" w:sz="8" w:space="0" w:color="000000"/>
-            </w:tcBorders>
-            <w:vAlign w:val="center"/>
-          </w:tcPr>
-          <w:p>
-            <w:pPr>
-              <w:pStyle w:val="EFLcellule"/>
-            </w:pPr>
-            <w:r>
-              <w:rPr>
-                <w:rStyle w:val="EFLmotgras"/>
-              </w:rPr>
-              <w:t>Montant des souscriptions</w:t>
-            </w:r>
-          </w:p>
-        </w:tc>
-        <w:tc>
-          <w:tcPr>
-            <w:tcW w:w="2197" w:type="dxa"/>
-            <w:tcBorders>
-              <w:top w:val="single" w:sz="8" w:space="0" w:color="000000"/>
-              <w:left w:val="single" w:sz="8" w:space="0" w:color="000000"/>
-              <w:bottom w:val="single" w:sz="8" w:space="0" w:color="000000"/>
-              <w:right w:val="single" w:sz="8" w:space="0" w:color="000000"/>
-            </w:tcBorders>
-            <w:vAlign w:val="center"/>
-          </w:tcPr>
-          <w:p>
-            <w:pPr>
-              <w:pStyle w:val="EFLcellule"/>
-            </w:pPr>
-            <w:r>
-              <w:rPr>
-                <w:rStyle w:val="EFLmotgras"/>
-              </w:rPr>
-              <w:t xml:space="preserve">Montant des versements effectués </w:t>
-            </w:r>
-          </w:p>
-        </w:tc>
-      </w:tr>
-      <w:tr>
-        <w:trPr>
-          <w:trHeight w:val="1739"/>
-        </w:trPr>
-        <w:tc>
-          <w:tcPr>
-            <w:tcW w:w="3676" w:type="dxa"/>
-            <w:tcBorders>
-              <w:top w:val="single" w:sz="8" w:space="0" w:color="000000"/>
-              <w:left w:val="single" w:sz="8" w:space="0" w:color="000000"/>
-              <w:bottom w:val="single" w:sz="8" w:space="0" w:color="000000"/>
-              <w:right w:val="single" w:sz="8" w:space="0" w:color="000000"/>
-            </w:tcBorders>
-            <w:vAlign w:val="center"/>
-          </w:tcPr>
-          <w:p>
-            <w:pPr>
-              <w:rPr>
-                <w:b/>
-                <w:bCs/>
-              </w:rPr>
-            </w:pPr>
-            <w:r>
-              <w:rPr>
-                <w:b/>
-                <w:bCs/>
-              </w:rPr>
-              <w:t xml:space="preserve">{civilite} </w:t>
-            </w:r>
-            <w:r>
-              <w:rPr>
-                <w:b/>
-                <w:bCs/>
-              </w:rPr>
-              <w:t xml:space="preserve">{prenom} {nom} </w:t>
-            </w:r>
-            <w:r>
-              <w:t>n</w:t>
-            </w:r>
-            <w:r>
-              <w:t xml:space="preserve">é le </w:t>
-            </w:r>
-            <w:r>
-              <w:rPr>
-                <w:b/>
-                <w:bCs/>
-              </w:rPr>
-              <w:t>0</w:t>
-            </w:r>
-            <w:r>
-              <w:rPr>
-                <w:b/>
-                <w:bCs/>
-              </w:rPr>
-              <w:t>2</w:t>
-            </w:r>
-            <w:r>
-              <w:rPr>
-                <w:b/>
-                <w:bCs/>
-              </w:rPr>
-              <w:t>/0</w:t>
-            </w:r>
-            <w:r>
-              <w:rPr>
-                <w:b/>
-                <w:bCs/>
-              </w:rPr>
-              <w:t>8</w:t>
-            </w:r>
-            <w:r>
-              <w:rPr>
-                <w:b/>
-                <w:bCs/>
-              </w:rPr>
-              <w:t>/2002</w:t>
-            </w:r>
-            <w:r>
-              <w:t xml:space="preserve"> à</w:t>
-            </w:r>
-            <w:r>
-              <w:t xml:space="preserve"> </w:t>
-            </w:r>
-            <w:r>
-              <w:rPr>
-                <w:b/>
-                <w:bCs/>
-              </w:rPr>
-              <w:t>{ville_naissance}</w:t>
-            </w:r>
-            <w:r>
-              <w:rPr>
-                <w:b/>
-                <w:bCs/>
-              </w:rPr>
-              <w:t xml:space="preserve"> </w:t>
-            </w:r>
-            <w:r>
-              <w:rPr>
-                <w:b/>
-                <w:bCs/>
-              </w:rPr>
-              <w:t>({cp_naissance})</w:t>
-            </w:r>
-            <w:r>
-              <w:t xml:space="preserve"> </w:t>
-            </w:r>
-            <w:r>
-              <w:t>de nationalit</w:t>
-            </w:r>
-            <w:r>
-              <w:t xml:space="preserve">é </w:t>
-            </w:r>
-            <w:r>
-              <w:t>Française</w:t>
-            </w:r>
-            <w:r>
-              <w:t xml:space="preserve"> demeurant au </w:t>
-            </w:r>
-            <w:r>
-              <w:rPr>
-                <w:b/>
-                <w:bCs/>
-              </w:rPr>
-              <w:t>13</w:t>
-            </w:r>
-            <w:r>
-              <w:rPr>
-                <w:b/>
-                <w:bCs/>
-              </w:rPr>
-              <w:t xml:space="preserve">5 Avenue </w:t>
-            </w:r>
-            <w:r>
-              <w:rPr>
-                <w:b/>
-                <w:bCs/>
-              </w:rPr>
-              <w:t>de Flandre</w:t>
-            </w:r>
-            <w:r>
-              <w:rPr>
-                <w:b/>
-                <w:bCs/>
-              </w:rPr>
-              <w:t xml:space="preserve"> </w:t>
-            </w:r>
-            <w:r>
-              <w:rPr>
-                <w:b/>
-                <w:bCs/>
-              </w:rPr>
-              <w:t>75019</w:t>
-            </w:r>
-            <w:r>
-              <w:rPr>
-                <w:b/>
-                <w:bCs/>
-              </w:rPr>
-              <w:t xml:space="preserve"> </w:t>
-            </w:r>
-            <w:r>
-              <w:rPr>
-                <w:b/>
-                <w:bCs/>
-              </w:rPr>
-              <w:t>Paris</w:t>
-            </w:r>
-          </w:p>
-        </w:tc>
-        <w:tc>
-          <w:tcPr>
-            <w:tcW w:w="1817" w:type="dxa"/>
-            <w:tcBorders>
-              <w:top w:val="single" w:sz="8" w:space="0" w:color="000000"/>
-              <w:left w:val="single" w:sz="8" w:space="0" w:color="000000"/>
-              <w:bottom w:val="single" w:sz="8" w:space="0" w:color="000000"/>
-              <w:right w:val="single" w:sz="8" w:space="0" w:color="000000"/>
-            </w:tcBorders>
-            <w:vAlign w:val="center"/>
-          </w:tcPr>
-          <w:p>
-            <w:pPr>
-              <w:pStyle w:val="EFLcellule"/>
-            </w:pPr>
-            <w:r>
-              <w:t>1</w:t>
-            </w:r>
-            <w:r>
-              <w:t>00</w:t>
-            </w:r>
-          </w:p>
-        </w:tc>
-        <w:tc>
-          <w:tcPr>
-            <w:tcW w:w="2197" w:type="dxa"/>
-            <w:tcBorders>
-              <w:top w:val="single" w:sz="8" w:space="0" w:color="000000"/>
-              <w:left w:val="single" w:sz="8" w:space="0" w:color="000000"/>
-              <w:bottom w:val="single" w:sz="8" w:space="0" w:color="000000"/>
-              <w:right w:val="single" w:sz="8" w:space="0" w:color="000000"/>
-            </w:tcBorders>
-            <w:vAlign w:val="center"/>
-          </w:tcPr>
-          <w:p>
-            <w:pPr>
-              <w:pStyle w:val="EFLcellule"/>
-            </w:pPr>
-            <w:r>
-              <w:t>1</w:t>
-            </w:r>
-            <w:r>
-              <w:t>0</w:t>
-            </w:r>
-            <w:r>
-              <w:t>0</w:t>
-            </w:r>
-            <w:r>
-              <w:t xml:space="preserve"> euro</w:t>
-            </w:r>
-            <w:r>
-              <w:t>s</w:t>
-            </w:r>
-          </w:p>
-        </w:tc>
-        <w:tc>
-          <w:tcPr>
-            <w:tcW w:w="2197" w:type="dxa"/>
-            <w:tcBorders>
-              <w:top w:val="single" w:sz="8" w:space="0" w:color="000000"/>
-              <w:left w:val="single" w:sz="8" w:space="0" w:color="000000"/>
-              <w:bottom w:val="single" w:sz="8" w:space="0" w:color="000000"/>
-              <w:right w:val="single" w:sz="8" w:space="0" w:color="000000"/>
-            </w:tcBorders>
-            <w:vAlign w:val="center"/>
-          </w:tcPr>
-          <w:p>
-            <w:pPr>
-              <w:pStyle w:val="EFLcellule"/>
-            </w:pPr>
-            <w:r>
-              <w:t>1</w:t>
-            </w:r>
-            <w:r>
-              <w:t>0</w:t>
-            </w:r>
-            <w:r>
-              <w:t>0</w:t>
-            </w:r>
-            <w:r>
-              <w:t xml:space="preserve"> euro</w:t>
-            </w:r>
-            <w:r>
-              <w:t>s</w:t>
-            </w:r>
-          </w:p>
-        </w:tc>
-      </w:tr>
-      <w:tr>
-        <w:trPr>
-          <w:trHeight w:val="1103"/>
-        </w:trPr>
-        <w:tc>
-          <w:tcPr>
-            <w:tcW w:w="3676" w:type="dxa"/>
-            <w:tcBorders>
-              <w:top w:val="single" w:sz="8" w:space="0" w:color="000000"/>
-              <w:left w:val="single" w:sz="8" w:space="0" w:color="000000"/>
-              <w:bottom w:val="single" w:sz="8" w:space="0" w:color="000000"/>
-              <w:right w:val="single" w:sz="8" w:space="0" w:color="000000"/>
-            </w:tcBorders>
-            <w:vAlign w:val="center"/>
-          </w:tcPr>
-          <w:p>
-            <w:pPr>
-              <w:pStyle w:val="EFLcellule"/>
-              <w:jc w:val="left"/>
-            </w:pPr>
-            <w:r>
-              <w:rPr>
-                <w:rStyle w:val="EFLmotgras"/>
-              </w:rPr>
-              <w:t>Total</w:t>
-            </w:r>
-          </w:p>
-        </w:tc>
-        <w:tc>
-          <w:tcPr>
-            <w:tcW w:w="1817" w:type="dxa"/>
-            <w:tcBorders>
-              <w:top w:val="single" w:sz="8" w:space="0" w:color="000000"/>
-              <w:left w:val="single" w:sz="8" w:space="0" w:color="000000"/>
-              <w:bottom w:val="single" w:sz="8" w:space="0" w:color="000000"/>
-              <w:right w:val="single" w:sz="8" w:space="0" w:color="000000"/>
-            </w:tcBorders>
-            <w:vAlign w:val="center"/>
-          </w:tcPr>
-          <w:p>
-            <w:pPr>
-              <w:pStyle w:val="EFLcellule"/>
-            </w:pPr>
-            <w:r>
-              <w:t>1</w:t>
-            </w:r>
-            <w:r>
-              <w:t>0</w:t>
-            </w:r>
-            <w:r>
-              <w:t>0</w:t>
-            </w:r>
-          </w:p>
-        </w:tc>
-        <w:tc>
-          <w:tcPr>
-            <w:tcW w:w="2197" w:type="dxa"/>
-            <w:tcBorders>
-              <w:top w:val="single" w:sz="8" w:space="0" w:color="000000"/>
-              <w:left w:val="single" w:sz="8" w:space="0" w:color="000000"/>
-              <w:bottom w:val="single" w:sz="8" w:space="0" w:color="000000"/>
-              <w:right w:val="single" w:sz="8" w:space="0" w:color="000000"/>
-            </w:tcBorders>
-            <w:vAlign w:val="center"/>
-          </w:tcPr>
-          <w:p>
-            <w:pPr>
-              <w:pStyle w:val="EFLcellule"/>
-            </w:pPr>
-            <w:r>
-              <w:t>1</w:t>
-            </w:r>
-            <w:r>
-              <w:t>0</w:t>
-            </w:r>
-            <w:r>
-              <w:t>0</w:t>
-            </w:r>
-            <w:r>
-              <w:t xml:space="preserve"> euros</w:t>
-            </w:r>
-          </w:p>
-        </w:tc>
-        <w:tc>
-          <w:tcPr>
-            <w:tcW w:w="2197" w:type="dxa"/>
-            <w:tcBorders>
-              <w:top w:val="single" w:sz="8" w:space="0" w:color="000000"/>
-              <w:left w:val="single" w:sz="8" w:space="0" w:color="000000"/>
-              <w:bottom w:val="single" w:sz="8" w:space="0" w:color="000000"/>
-              <w:right w:val="single" w:sz="8" w:space="0" w:color="000000"/>
-            </w:tcBorders>
-            <w:vAlign w:val="center"/>
-          </w:tcPr>
-          <w:p>
-            <w:pPr>
-              <w:pStyle w:val="EFLcellule"/>
-            </w:pPr>
-            <w:r>
-              <w:t xml:space="preserve"> </w:t>
-            </w:r>
-            <w:r>
-              <w:t>1</w:t>
-            </w:r>
-            <w:r>
-              <w:t>0</w:t>
-            </w:r>
-            <w:r>
-              <w:t>0</w:t>
-            </w:r>
-            <w:r>
-              <w:t xml:space="preserve"> euros</w:t>
-            </w:r>
-          </w:p>
-        </w:tc>
-      </w:tr>
-    </w:tbl>
-    <w:p>
-      <w:pPr>
-        <w:pStyle w:val="EFLtitrenotepv"/>
-      </w:pPr>
-      <w:r>
-        <w:t>ETAT DES SOUSCRIPTIONS ET DES VERSEMENTS</w:t>
-      </w:r>
-    </w:p>
-    <w:p/>
-    <w:p/>
-    <w:p>
-      <w:r>
-        <w:t xml:space="preserve">Le présent état qui constate la souscription de </w:t>
-      </w:r>
-      <w:r>
-        <w:t>1</w:t>
-      </w:r>
-      <w:r>
-        <w:t>00</w:t>
-      </w:r>
-      <w:r>
-        <w:t xml:space="preserve"> actions de la Société </w:t>
-      </w:r>
-      <w:r>
-        <w:rPr>
-          <w:b/>
-          <w:bCs/>
-        </w:rPr>
-        <w:t>{denomination}</w:t>
-      </w:r>
-      <w:r>
-        <w:rPr>
-          <w:b/>
-          <w:bCs/>
-        </w:rPr>
-        <w:t xml:space="preserve"> </w:t>
-      </w:r>
-      <w:r>
-        <w:t xml:space="preserve">ainsi que </w:t>
-      </w:r>
-      <w:r>
-        <w:t xml:space="preserve"> </w:t>
-      </w:r>
-      <w:r>
-        <w:t>le versement de la somme de</w:t>
-      </w:r>
-      <w:r>
-        <w:t xml:space="preserve"> </w:t>
-      </w:r>
-      <w:r>
-        <w:t>1</w:t>
-      </w:r>
-      <w:r>
-        <w:t>00</w:t>
-      </w:r>
-      <w:r>
-        <w:t xml:space="preserve"> euros correspondant </w:t>
-      </w:r>
-      <w:r>
-        <w:t>au</w:t>
-      </w:r>
-      <w:r>
-        <w:t xml:space="preserve"> capital libéré lors de la souscription du capital</w:t>
-      </w:r>
-      <w:r>
-        <w:t xml:space="preserve"> des</w:t>
-      </w:r>
-      <w:r>
-        <w:t xml:space="preserve"> </w:t>
-      </w:r>
-      <w:r>
-        <w:t xml:space="preserve">dites actions, est certifié exact, sincère et véritable par </w:t>
-      </w:r>
-      <w:r>
-        <w:t>le président.</w:t>
-      </w:r>
-    </w:p>
-    <w:p>
-      <w:r>
-        <w:t xml:space="preserve">Fait </w:t>
-      </w:r>
-      <w:r>
-        <w:t xml:space="preserve">à </w:t>
-      </w:r>
-      <w:r>
-        <w:rPr>
-          <w:b/>
-          <w:bCs/>
-        </w:rPr>
-        <w:t>Pa</w:t>
-      </w:r>
-      <w:r>
-        <w:rPr>
-          <w:b/>
-          <w:bCs/>
-        </w:rPr>
-        <w:t>ris</w:t>
-      </w:r>
-    </w:p>
-    <w:p>
-      <w:r>
-        <w:t xml:space="preserve">Le </w:t>
-      </w:r>
-      <w:r>
-        <w:rPr>
-          <w:b/>
-          <w:bCs/>
-        </w:rPr>
-        <w:t>{date_signature}</w:t>
-      </w:r>
-    </w:p>
-    <w:p>
-      <w:pPr>
-        <w:rPr>
-          <w:b/>
-          <w:bCs/>
-        </w:rPr>
-      </w:pPr>
-      <w:r>
-        <w:rPr>
-          <w:b/>
-          <w:bCs/>
-        </w:rPr>
-        <w:t xml:space="preserve">{civilite} </w:t>
-      </w:r>
-      <w:r>
-        <w:rPr>
-          <w:b/>
-          <w:bCs/>
-        </w:rPr>
-        <w:t>{prenom} {nom}</w:t>
-      </w:r>
-    </w:p>
-    <w:p>
-      <w:pPr>
-        <w:ind w:left="3540"/>
-      </w:pPr>
-    </w:p>
-    <w:p/>
-    <w:p/>
-    <w:sectPr>
-      <w:pgSz w:w="11880" w:h="16840"/>
-      <w:pgMar w:top="1418" w:right="1418" w:bottom="1418" w:left="1418" w:header="709" w:footer="709" w:gutter="0"/>
-      <w:cols w:space="709"/>
-      <w:noEndnote/>
-      <w:titlePg/>
-    </w:sectPr>
-  </w:body>
-</w:document>
+<file path=word/document.xml><?xml version="1.0" encoding="UTF-8" standalone="yes"?>
+<w:document xmlns:wpc="http://schemas.microsoft.com/office/word/2010/wordprocessingCanvas" xmlns:cx="http://schemas.microsoft.com/office/drawing/2014/chartex" xmlns:cx1="http://schemas.microsoft.com/office/drawing/2015/9/8/chartex" xmlns:cx2="http://schemas.microsoft.com/office/drawing/2015/10/21/chartex" xmlns:cx3="http://schemas.microsoft.com/office/drawing/2016/5/9/chartex" xmlns:cx4="http://schemas.microsoft.com/office/drawing/2016/5/10/chartex" xmlns:cx5="http://schemas.microsoft.com/office/drawing/2016/5/11/chartex" xmlns:cx6="http://schemas.microsoft.com/office/drawing/2016/5/12/chartex" xmlns:cx7="http://schemas.microsoft.com/office/drawing/2016/5/13/chartex" xmlns:cx8="http://schemas.microsoft.com/office/drawing/2016/5/14/chartex" xmlns:mc="http://schemas.openxmlformats.org/markup-compatibility/2006" xmlns:aink="http://schemas.microsoft.com/office/drawing/2016/ink" xmlns:am3d="http://schemas.microsoft.com/office/drawing/2017/model3d" xmlns:o="urn:schemas-microsoft-com:office:office" xmlns:oel="http://schemas.microsoft.com/office/2019/extlst" xmlns:r="http://schemas.openxmlformats.org/officeDocument/2006/relationships" xmlns:m="http://schemas.openxmlformats.org/officeDocument/2006/math" xmlns:v="urn:schemas-microsoft-com:vml" xmlns:wp14="http://schemas.microsoft.com/office/word/2010/wordprocessingDrawing" xmlns:wp="http://schemas.openxmlformats.org/drawingml/2006/wordprocessingDrawing" xmlns:w10="urn:schemas-microsoft-com:office:word" xmlns:w="http://schemas.openxmlformats.org/wordprocessingml/2006/main" xmlns:w14="http://schemas.microsoft.com/office/word/2010/wordml" xmlns:w15="http://schemas.microsoft.com/office/word/2012/wordml" xmlns:w16cex="http://schemas.microsoft.com/office/word/2018/wordml/cex" xmlns:w16cid="http://schemas.microsoft.com/office/word/2016/wordml/cid" xmlns:w16="http://schemas.microsoft.com/office/word/2018/wordml" xmlns:w16du="http://schemas.microsoft.com/office/word/2023/wordml/word16du" xmlns:w16sdtdh="http://schemas.microsoft.com/office/word/2020/wordml/sdtdatahash" xmlns:w16sdtfl="http://schemas.microsoft.com/office/word/2024/wordml/sdtformatlock" xmlns:w16se="http://schemas.microsoft.com/office/word/2015/wordml/symex" xmlns:wpg="http://schemas.microsoft.com/office/word/2010/wordprocessingGroup" xmlns:wpi="http://schemas.microsoft.com/office/word/2010/wordprocessingInk" xmlns:wne="http://schemas.microsoft.com/office/word/2006/wordml" xmlns:wps="http://schemas.microsoft.com/office/word/2010/wordprocessingShape" mc:Ignorable="w14 w15 w16se w16cid w16 w16cex w16sdtdh w16sdtfl w16du wp14"><w:body><w:p><w:pPr><w:pStyle w:val="En-teteSteActe3"/><w:rPr><w:szCs w:val="22"/></w:rPr></w:pPr><w:r><w:rPr><w:szCs w:val="22"/></w:rPr><w:t xml:space="preserve">S.A.S.U </w:t></w:r><w:r><w:rPr><w:szCs w:val="22"/></w:rPr><w:t>{denomination}</w:t></w:r><w:r><w:rPr><w:szCs w:val="22"/></w:rPr><w:t xml:space="preserve"> </w:t></w:r><w:r><w:rPr><w:szCs w:val="22"/></w:rPr><w:t xml:space="preserve"> </w:t></w:r></w:p><w:p><w:pPr><w:pStyle w:val="En-teteSteActe3"/><w:rPr><w:szCs w:val="22"/></w:rPr></w:pPr><w:r><w:rPr><w:szCs w:val="22"/></w:rPr><w:t xml:space="preserve">au capital de </w:t></w:r><w:r><w:rPr><w:szCs w:val="22"/></w:rPr><w:t>{capital} Euros</w:t></w:r></w:p><w:p><w:pPr><w:pStyle w:val="En-teteSteActe3"/><w:rPr><w:sz w:val="24"/><w:szCs w:val="24"/></w:rPr></w:pPr><w:r><w:rPr><w:szCs w:val="22"/></w:rPr><w:t xml:space="preserve">Siège social : </w:t></w:r><w:bookmarkStart w:id="0" w:name="_Hlk120783997"/><w:r><w:rPr><w:sz w:val="24"/><w:szCs w:val="24"/></w:rPr><w:t>{siege_social}</w:t></w:r></w:p><w:bookmarkEnd w:id="0"/><w:p><w:pPr><w:pStyle w:val="En-teteSteActe3"/></w:pPr><w:r><w:t>Société en cours de constitution</w:t></w:r></w:p><w:tbl><w:tblPr><w:tblpPr w:leftFromText="141" w:rightFromText="141" w:vertAnchor="text" w:horzAnchor="margin" w:tblpXSpec="center" w:tblpY="2244"/><w:tblW w:w="9887" w:type="dxa"/><w:tblBorders><w:top w:val="single" w:sz="8" w:space="0" w:color="auto"/><w:left w:val="single" w:sz="8" w:space="0" w:color="auto"/><w:bottom w:val="single" w:sz="8" w:space="0" w:color="auto"/><w:right w:val="single" w:sz="8" w:space="0" w:color="auto"/></w:tblBorders><w:tblLayout w:type="fixed"/><w:tblLook w:val="04A0" w:firstRow="1" w:lastRow="0" w:firstColumn="1" w:lastColumn="0" w:noHBand="0" w:noVBand="1"/></w:tblPr><w:tblGrid><w:gridCol w:w="3676"/><w:gridCol w:w="1817"/><w:gridCol w:w="2197"/><w:gridCol w:w="2197"/></w:tblGrid><w:tr><w:trPr><w:trHeight w:val="973"/><w:tblHeader/></w:trPr><w:tc><w:tcPr><w:tcW w:w="3676" w:type="dxa"/><w:tcBorders><w:top w:val="single" w:sz="8" w:space="0" w:color="000000"/><w:left w:val="single" w:sz="8" w:space="0" w:color="000000"/><w:bottom w:val="single" w:sz="8" w:space="0" w:color="000000"/><w:right w:val="single" w:sz="8" w:space="0" w:color="000000"/></w:tcBorders><w:vAlign w:val="center"/></w:tcPr><w:p><w:pPr><w:pStyle w:val="EFLcellule"/><w:jc w:val="left"/></w:pPr><w:r><w:rPr><w:rStyle w:val="EFLmotgras"/></w:rPr><w:t>Identité ou désignation des Souscripteurs</w:t></w:r></w:p></w:tc><w:tc><w:tcPr><w:tcW w:w="1817" w:type="dxa"/><w:tcBorders><w:top w:val="single" w:sz="8" w:space="0" w:color="000000"/><w:left w:val="single" w:sz="8" w:space="0" w:color="000000"/><w:bottom w:val="single" w:sz="8" w:space="0" w:color="000000"/><w:right w:val="single" w:sz="8" w:space="0" w:color="000000"/></w:tcBorders><w:vAlign w:val="center"/></w:tcPr><w:p><w:pPr><w:pStyle w:val="EFLcellule"/></w:pPr><w:r><w:rPr><w:rStyle w:val="EFLmotgras"/></w:rPr><w:t>Nombre d'actions souscrites</w:t></w:r></w:p></w:tc><w:tc><w:tcPr><w:tcW w:w="2197" w:type="dxa"/><w:tcBorders><w:top w:val="single" w:sz="8" w:space="0" w:color="000000"/><w:left w:val="single" w:sz="8" w:space="0" w:color="000000"/><w:bottom w:val="single" w:sz="8" w:space="0" w:color="000000"/><w:right w:val="single" w:sz="8" w:space="0" w:color="000000"/></w:tcBorders><w:vAlign w:val="center"/></w:tcPr><w:p><w:pPr><w:pStyle w:val="EFLcellule"/></w:pPr><w:r><w:rPr><w:rStyle w:val="EFLmotgras"/></w:rPr><w:t>Montant des souscriptions</w:t></w:r></w:p></w:tc><w:tc><w:tcPr><w:tcW w:w="2197" w:type="dxa"/><w:tcBorders><w:top w:val="single" w:sz="8" w:space="0" w:color="000000"/><w:left w:val="single" w:sz="8" w:space="0" w:color="000000"/><w:bottom w:val="single" w:sz="8" w:space="0" w:color="000000"/><w:right w:val="single" w:sz="8" w:space="0" w:color="000000"/></w:tcBorders><w:vAlign w:val="center"/></w:tcPr><w:p><w:pPr><w:pStyle w:val="EFLcellule"/></w:pPr><w:r><w:rPr><w:rStyle w:val="EFLmotgras"/></w:rPr><w:t xml:space="preserve">Montant des versements effectués </w:t></w:r></w:p></w:tc></w:tr><w:tr><w:trPr><w:trHeight w:val="1739"/></w:trPr><w:tc><w:tcPr><w:tcW w:w="3676" w:type="dxa"/><w:tcBorders><w:top w:val="single" w:sz="8" w:space="0" w:color="000000"/><w:left w:val="single" w:sz="8" w:space="0" w:color="000000"/><w:bottom w:val="single" w:sz="8" w:space="0" w:color="000000"/><w:right w:val="single" w:sz="8" w:space="0" w:color="000000"/></w:tcBorders><w:vAlign w:val="center"/></w:tcPr><w:p><w:pPr><w:rPr><w:b/><w:bCs/></w:rPr></w:pPr><w:r><w:rPr><w:b/><w:bCs/></w:rPr><w:t xml:space="preserve">{civilite} </w:t></w:r><w:r><w:rPr><w:b/><w:bCs/></w:rPr><w:t xml:space="preserve">{prenom} {nom} </w:t></w:r><w:r><w:t>n</w:t></w:r><w:r><w:t xml:space="preserve">é le </w:t></w:r><w:r><w:rPr><w:b/><w:bCs/></w:rPr><w:t>0</w:t></w:r><w:r><w:rPr><w:b/><w:bCs/></w:rPr><w:t>2</w:t></w:r><w:r><w:r><w:rPr><w:b/><w:bCs/></w:rPr><w:t>{date_naissance}</w:t></w:r><w:r><w:t xml:space="preserve"> à</w:t></w:r><w:r><w:t xml:space="preserve"> </w:t></w:r><w:r><w:rPr><w:b/><w:bCs/></w:rPr><w:t>{ville_naissance}</w:t></w:r><w:r><w:rPr><w:b/><w:bCs/></w:rPr><w:t xml:space="preserve"> </w:t></w:r><w:r><w:rPr><w:b/><w:bCs/></w:rPr><w:t>({cp_naissance})</w:t></w:r><w:r><w:t xml:space="preserve"> </w:t></w:r><w:r><w:t>de nationalit</w:t></w:r><w:r><w:t xml:space="preserve">é </w:t></w:r><w:r><w:t>Française</w:t></w:r><w:r><w:t xml:space="preserve"> demeurant au </w:t></w:r><w:r><w:rPr><w:b/><w:bCs/></w:rPr><w:t>{adresse}</w:t></w:r></w:p></w:tc><w:tc><w:tcPr><w:tcW w:w="1817" w:type="dxa"/><w:tcBorders><w:top w:val="single" w:sz="8" w:space="0" w:color="000000"/><w:left w:val="single" w:sz="8" w:space="0" w:color="000000"/><w:bottom w:val="single" w:sz="8" w:space="0" w:color="000000"/><w:right w:val="single" w:sz="8" w:space="0" w:color="000000"/></w:tcBorders><w:vAlign w:val="center"/></w:tcPr><w:p><w:pPr><w:pStyle w:val="EFLcellule"/></w:pPr><w:r><w:t>1</w:t></w:r><w:r><w:t>00</w:t></w:r></w:p></w:tc><w:tc><w:tcPr><w:tcW w:w="2197" w:type="dxa"/><w:tcBorders><w:top w:val="single" w:sz="8" w:space="0" w:color="000000"/><w:left w:val="single" w:sz="8" w:space="0" w:color="000000"/><w:bottom w:val="single" w:sz="8" w:space="0" w:color="000000"/><w:right w:val="single" w:sz="8" w:space="0" w:color="000000"/></w:tcBorders><w:vAlign w:val="center"/></w:tcPr><w:p><w:pPr><w:pStyle w:val="EFLcellule"/></w:pPr><w:r><w:t>1</w:t></w:r><w:r><w:t>0</w:t></w:r><w:r><w:t>0</w:t></w:r><w:r><w:t xml:space="preserve"> euro</w:t></w:r><w:r><w:t>s</w:t></w:r></w:p></w:tc><w:tc><w:tcPr><w:tcW w:w="2197" w:type="dxa"/><w:tcBorders><w:top w:val="single" w:sz="8" w:space="0" w:color="000000"/><w:left w:val="single" w:sz="8" w:space="0" w:color="000000"/><w:bottom w:val="single" w:sz="8" w:space="0" w:color="000000"/><w:right w:val="single" w:sz="8" w:space="0" w:color="000000"/></w:tcBorders><w:vAlign w:val="center"/></w:tcPr><w:p><w:pPr><w:pStyle w:val="EFLcellule"/></w:pPr><w:r><w:t>1</w:t></w:r><w:r><w:t>0</w:t></w:r><w:r><w:t>0</w:t></w:r><w:r><w:t xml:space="preserve"> euro</w:t></w:r><w:r><w:t>s</w:t></w:r></w:p></w:tc></w:tr><w:tr><w:trPr><w:trHeight w:val="1103"/></w:trPr><w:tc><w:tcPr><w:tcW w:w="3676" w:type="dxa"/><w:tcBorders><w:top w:val="single" w:sz="8" w:space="0" w:color="000000"/><w:left w:val="single" w:sz="8" w:space="0" w:color="000000"/><w:bottom w:val="single" w:sz="8" w:space="0" w:color="000000"/><w:right w:val="single" w:sz="8" w:space="0" w:color="000000"/></w:tcBorders><w:vAlign w:val="center"/></w:tcPr><w:p><w:pPr><w:pStyle w:val="EFLcellule"/><w:jc w:val="left"/></w:pPr><w:r><w:rPr><w:rStyle w:val="EFLmotgras"/></w:rPr><w:t>Total</w:t></w:r></w:p></w:tc><w:tc><w:tcPr><w:tcW w:w="1817" w:type="dxa"/><w:tcBorders><w:top w:val="single" w:sz="8" w:space="0" w:color="000000"/><w:left w:val="single" w:sz="8" w:space="0" w:color="000000"/><w:bottom w:val="single" w:sz="8" w:space="0" w:color="000000"/><w:right w:val="single" w:sz="8" w:space="0" w:color="000000"/></w:tcBorders><w:vAlign w:val="center"/></w:tcPr><w:p><w:pPr><w:pStyle w:val="EFLcellule"/></w:pPr><w:r><w:t>1</w:t></w:r><w:r><w:t>0</w:t></w:r><w:r><w:t>0</w:t></w:r></w:p></w:tc><w:tc><w:tcPr><w:tcW w:w="2197" w:type="dxa"/><w:tcBorders><w:top w:val="single" w:sz="8" w:space="0" w:color="000000"/><w:left w:val="single" w:sz="8" w:space="0" w:color="000000"/><w:bottom w:val="single" w:sz="8" w:space="0" w:color="000000"/><w:right w:val="single" w:sz="8" w:space="0" w:color="000000"/></w:tcBorders><w:vAlign w:val="center"/></w:tcPr><w:p><w:pPr><w:pStyle w:val="EFLcellule"/></w:pPr><w:r><w:t>1</w:t></w:r><w:r><w:t>0</w:t></w:r><w:r><w:t>0</w:t></w:r><w:r><w:t xml:space="preserve"> euros</w:t></w:r></w:p></w:tc><w:tc><w:tcPr><w:tcW w:w="2197" w:type="dxa"/><w:tcBorders><w:top w:val="single" w:sz="8" w:space="0" w:color="000000"/><w:left w:val="single" w:sz="8" w:space="0" w:color="000000"/><w:bottom w:val="single" w:sz="8" w:space="0" w:color="000000"/><w:right w:val="single" w:sz="8" w:space="0" w:color="000000"/></w:tcBorders><w:vAlign w:val="center"/></w:tcPr><w:p><w:pPr><w:pStyle w:val="EFLcellule"/></w:pPr><w:r><w:t xml:space="preserve"> </w:t></w:r><w:r><w:t>1</w:t></w:r><w:r><w:t>0</w:t></w:r><w:r><w:t>0</w:t></w:r><w:r><w:t xml:space="preserve"> euros</w:t></w:r></w:p></w:tc></w:tr></w:tbl><w:p><w:pPr><w:pStyle w:val="EFLtitrenotepv"/></w:pPr><w:r><w:t>ETAT DES SOUSCRIPTIONS ET DES VERSEMENTS</w:t></w:r></w:p><w:p/><w:p/><w:p><w:r><w:t xml:space="preserve">Le présent état qui constate la souscription de </w:t></w:r><w:r><w:t>1</w:t></w:r><w:r><w:t>00</w:t></w:r><w:r><w:t xml:space="preserve"> actions de la Société </w:t></w:r><w:r><w:rPr><w:b/><w:bCs/></w:rPr><w:t>{denomination}</w:t></w:r><w:r><w:rPr><w:b/><w:bCs/></w:rPr><w:t xml:space="preserve"> </w:t></w:r><w:r><w:t xml:space="preserve">ainsi que </w:t></w:r><w:r><w:t xml:space="preserve"> </w:t></w:r><w:r><w:t>le versement de la somme de</w:t></w:r><w:r><w:t xml:space="preserve"> </w:t></w:r><w:r><w:t>1</w:t></w:r><w:r><w:t>00</w:t></w:r><w:r><w:t xml:space="preserve"> euros correspondant </w:t></w:r><w:r><w:t>au</w:t></w:r><w:r><w:t xml:space="preserve"> capital libéré lors de la souscription du capital</w:t></w:r><w:r><w:t xml:space="preserve"> des</w:t></w:r><w:r><w:t xml:space="preserve"> </w:t></w:r><w:r><w:t xml:space="preserve">dites actions, est certifié exact, sincère et véritable par </w:t></w:r><w:r><w:t>le président.</w:t></w:r></w:p><w:p><w:r><w:t xml:space="preserve">Fait </w:t></w:r><w:r><w:t xml:space="preserve">à </w:t></w:r><w:r><w:rPr><w:b/><w:bCs/></w:rPr><w:t>{ville_signature}</w:t></w:r></w:p><w:p><w:r><w:t xml:space="preserve">Le </w:t></w:r><w:r><w:rPr><w:b/><w:bCs/></w:rPr><w:t>{date_signature}</w:t></w:r></w:p><w:p><w:pPr><w:rPr><w:b/><w:bCs/></w:rPr></w:pPr><w:r><w:rPr><w:b/><w:bCs/></w:rPr><w:t xml:space="preserve">{civilite} </w:t></w:r><w:r><w:rPr><w:b/><w:bCs/></w:rPr><w:t>{prenom} {nom}</w:t></w:r></w:p><w:p><w:pPr><w:ind w:left="3540"/></w:pPr></w:p><w:p/><w:p/><w:sectPr><w:pgSz w:w="11880" w:h="16840"/><w:pgMar w:top="1418" w:right="1418" w:bottom="1418" w:left="1418" w:header="709" w:footer="709" w:gutter="0"/><w:cols w:space="709"/><w:noEndnote/><w:titlePg/></w:sectPr></w:body></w:document>
 </file>
 
 <file path=word/endnotes.xml><?xml version="1.0" encoding="utf-8"?>

</xml_diff>

<commit_message>
Fix souscripteurs: nb_actions=capital, suppr 02 residuel avant date_naissance
</commit_message>
<xml_diff>
--- a/templates/sasu/souscripteurs.docx
+++ b/templates/sasu/souscripteurs.docx
@@ -1,6 +1,656 @@
 
-<file path=word/document.xml><?xml version="1.0" encoding="UTF-8" standalone="yes"?>
-<w:document xmlns:wpc="http://schemas.microsoft.com/office/word/2010/wordprocessingCanvas" xmlns:cx="http://schemas.microsoft.com/office/drawing/2014/chartex" xmlns:cx1="http://schemas.microsoft.com/office/drawing/2015/9/8/chartex" xmlns:cx2="http://schemas.microsoft.com/office/drawing/2015/10/21/chartex" xmlns:cx3="http://schemas.microsoft.com/office/drawing/2016/5/9/chartex" xmlns:cx4="http://schemas.microsoft.com/office/drawing/2016/5/10/chartex" xmlns:cx5="http://schemas.microsoft.com/office/drawing/2016/5/11/chartex" xmlns:cx6="http://schemas.microsoft.com/office/drawing/2016/5/12/chartex" xmlns:cx7="http://schemas.microsoft.com/office/drawing/2016/5/13/chartex" xmlns:cx8="http://schemas.microsoft.com/office/drawing/2016/5/14/chartex" xmlns:mc="http://schemas.openxmlformats.org/markup-compatibility/2006" xmlns:aink="http://schemas.microsoft.com/office/drawing/2016/ink" xmlns:am3d="http://schemas.microsoft.com/office/drawing/2017/model3d" xmlns:o="urn:schemas-microsoft-com:office:office" xmlns:oel="http://schemas.microsoft.com/office/2019/extlst" xmlns:r="http://schemas.openxmlformats.org/officeDocument/2006/relationships" xmlns:m="http://schemas.openxmlformats.org/officeDocument/2006/math" xmlns:v="urn:schemas-microsoft-com:vml" xmlns:wp14="http://schemas.microsoft.com/office/word/2010/wordprocessingDrawing" xmlns:wp="http://schemas.openxmlformats.org/drawingml/2006/wordprocessingDrawing" xmlns:w10="urn:schemas-microsoft-com:office:word" xmlns:w="http://schemas.openxmlformats.org/wordprocessingml/2006/main" xmlns:w14="http://schemas.microsoft.com/office/word/2010/wordml" xmlns:w15="http://schemas.microsoft.com/office/word/2012/wordml" xmlns:w16cex="http://schemas.microsoft.com/office/word/2018/wordml/cex" xmlns:w16cid="http://schemas.microsoft.com/office/word/2016/wordml/cid" xmlns:w16="http://schemas.microsoft.com/office/word/2018/wordml" xmlns:w16du="http://schemas.microsoft.com/office/word/2023/wordml/word16du" xmlns:w16sdtdh="http://schemas.microsoft.com/office/word/2020/wordml/sdtdatahash" xmlns:w16sdtfl="http://schemas.microsoft.com/office/word/2024/wordml/sdtformatlock" xmlns:w16se="http://schemas.microsoft.com/office/word/2015/wordml/symex" xmlns:wpg="http://schemas.microsoft.com/office/word/2010/wordprocessingGroup" xmlns:wpi="http://schemas.microsoft.com/office/word/2010/wordprocessingInk" xmlns:wne="http://schemas.microsoft.com/office/word/2006/wordml" xmlns:wps="http://schemas.microsoft.com/office/word/2010/wordprocessingShape" mc:Ignorable="w14 w15 w16se w16cid w16 w16cex w16sdtdh w16sdtfl w16du wp14"><w:body><w:p><w:pPr><w:pStyle w:val="En-teteSteActe3"/><w:rPr><w:szCs w:val="22"/></w:rPr></w:pPr><w:r><w:rPr><w:szCs w:val="22"/></w:rPr><w:t xml:space="preserve">S.A.S.U </w:t></w:r><w:r><w:rPr><w:szCs w:val="22"/></w:rPr><w:t>{denomination}</w:t></w:r><w:r><w:rPr><w:szCs w:val="22"/></w:rPr><w:t xml:space="preserve"> </w:t></w:r><w:r><w:rPr><w:szCs w:val="22"/></w:rPr><w:t xml:space="preserve"> </w:t></w:r></w:p><w:p><w:pPr><w:pStyle w:val="En-teteSteActe3"/><w:rPr><w:szCs w:val="22"/></w:rPr></w:pPr><w:r><w:rPr><w:szCs w:val="22"/></w:rPr><w:t xml:space="preserve">au capital de </w:t></w:r><w:r><w:rPr><w:szCs w:val="22"/></w:rPr><w:t>{capital} Euros</w:t></w:r></w:p><w:p><w:pPr><w:pStyle w:val="En-teteSteActe3"/><w:rPr><w:sz w:val="24"/><w:szCs w:val="24"/></w:rPr></w:pPr><w:r><w:rPr><w:szCs w:val="22"/></w:rPr><w:t xml:space="preserve">Siège social : </w:t></w:r><w:bookmarkStart w:id="0" w:name="_Hlk120783997"/><w:r><w:rPr><w:sz w:val="24"/><w:szCs w:val="24"/></w:rPr><w:t>{siege_social}</w:t></w:r></w:p><w:bookmarkEnd w:id="0"/><w:p><w:pPr><w:pStyle w:val="En-teteSteActe3"/></w:pPr><w:r><w:t>Société en cours de constitution</w:t></w:r></w:p><w:tbl><w:tblPr><w:tblpPr w:leftFromText="141" w:rightFromText="141" w:vertAnchor="text" w:horzAnchor="margin" w:tblpXSpec="center" w:tblpY="2244"/><w:tblW w:w="9887" w:type="dxa"/><w:tblBorders><w:top w:val="single" w:sz="8" w:space="0" w:color="auto"/><w:left w:val="single" w:sz="8" w:space="0" w:color="auto"/><w:bottom w:val="single" w:sz="8" w:space="0" w:color="auto"/><w:right w:val="single" w:sz="8" w:space="0" w:color="auto"/></w:tblBorders><w:tblLayout w:type="fixed"/><w:tblLook w:val="04A0" w:firstRow="1" w:lastRow="0" w:firstColumn="1" w:lastColumn="0" w:noHBand="0" w:noVBand="1"/></w:tblPr><w:tblGrid><w:gridCol w:w="3676"/><w:gridCol w:w="1817"/><w:gridCol w:w="2197"/><w:gridCol w:w="2197"/></w:tblGrid><w:tr><w:trPr><w:trHeight w:val="973"/><w:tblHeader/></w:trPr><w:tc><w:tcPr><w:tcW w:w="3676" w:type="dxa"/><w:tcBorders><w:top w:val="single" w:sz="8" w:space="0" w:color="000000"/><w:left w:val="single" w:sz="8" w:space="0" w:color="000000"/><w:bottom w:val="single" w:sz="8" w:space="0" w:color="000000"/><w:right w:val="single" w:sz="8" w:space="0" w:color="000000"/></w:tcBorders><w:vAlign w:val="center"/></w:tcPr><w:p><w:pPr><w:pStyle w:val="EFLcellule"/><w:jc w:val="left"/></w:pPr><w:r><w:rPr><w:rStyle w:val="EFLmotgras"/></w:rPr><w:t>Identité ou désignation des Souscripteurs</w:t></w:r></w:p></w:tc><w:tc><w:tcPr><w:tcW w:w="1817" w:type="dxa"/><w:tcBorders><w:top w:val="single" w:sz="8" w:space="0" w:color="000000"/><w:left w:val="single" w:sz="8" w:space="0" w:color="000000"/><w:bottom w:val="single" w:sz="8" w:space="0" w:color="000000"/><w:right w:val="single" w:sz="8" w:space="0" w:color="000000"/></w:tcBorders><w:vAlign w:val="center"/></w:tcPr><w:p><w:pPr><w:pStyle w:val="EFLcellule"/></w:pPr><w:r><w:rPr><w:rStyle w:val="EFLmotgras"/></w:rPr><w:t>Nombre d'actions souscrites</w:t></w:r></w:p></w:tc><w:tc><w:tcPr><w:tcW w:w="2197" w:type="dxa"/><w:tcBorders><w:top w:val="single" w:sz="8" w:space="0" w:color="000000"/><w:left w:val="single" w:sz="8" w:space="0" w:color="000000"/><w:bottom w:val="single" w:sz="8" w:space="0" w:color="000000"/><w:right w:val="single" w:sz="8" w:space="0" w:color="000000"/></w:tcBorders><w:vAlign w:val="center"/></w:tcPr><w:p><w:pPr><w:pStyle w:val="EFLcellule"/></w:pPr><w:r><w:rPr><w:rStyle w:val="EFLmotgras"/></w:rPr><w:t>Montant des souscriptions</w:t></w:r></w:p></w:tc><w:tc><w:tcPr><w:tcW w:w="2197" w:type="dxa"/><w:tcBorders><w:top w:val="single" w:sz="8" w:space="0" w:color="000000"/><w:left w:val="single" w:sz="8" w:space="0" w:color="000000"/><w:bottom w:val="single" w:sz="8" w:space="0" w:color="000000"/><w:right w:val="single" w:sz="8" w:space="0" w:color="000000"/></w:tcBorders><w:vAlign w:val="center"/></w:tcPr><w:p><w:pPr><w:pStyle w:val="EFLcellule"/></w:pPr><w:r><w:rPr><w:rStyle w:val="EFLmotgras"/></w:rPr><w:t xml:space="preserve">Montant des versements effectués </w:t></w:r></w:p></w:tc></w:tr><w:tr><w:trPr><w:trHeight w:val="1739"/></w:trPr><w:tc><w:tcPr><w:tcW w:w="3676" w:type="dxa"/><w:tcBorders><w:top w:val="single" w:sz="8" w:space="0" w:color="000000"/><w:left w:val="single" w:sz="8" w:space="0" w:color="000000"/><w:bottom w:val="single" w:sz="8" w:space="0" w:color="000000"/><w:right w:val="single" w:sz="8" w:space="0" w:color="000000"/></w:tcBorders><w:vAlign w:val="center"/></w:tcPr><w:p><w:pPr><w:rPr><w:b/><w:bCs/></w:rPr></w:pPr><w:r><w:rPr><w:b/><w:bCs/></w:rPr><w:t xml:space="preserve">{civilite} </w:t></w:r><w:r><w:rPr><w:b/><w:bCs/></w:rPr><w:t xml:space="preserve">{prenom} {nom} </w:t></w:r><w:r><w:t>n</w:t></w:r><w:r><w:t xml:space="preserve">é le </w:t></w:r><w:r><w:rPr><w:b/><w:bCs/></w:rPr><w:t>0</w:t></w:r><w:r><w:rPr><w:b/><w:bCs/></w:rPr><w:t>2</w:t></w:r><w:r><w:r><w:rPr><w:b/><w:bCs/></w:rPr><w:t>{date_naissance}</w:t></w:r><w:r><w:t xml:space="preserve"> à</w:t></w:r><w:r><w:t xml:space="preserve"> </w:t></w:r><w:r><w:rPr><w:b/><w:bCs/></w:rPr><w:t>{ville_naissance}</w:t></w:r><w:r><w:rPr><w:b/><w:bCs/></w:rPr><w:t xml:space="preserve"> </w:t></w:r><w:r><w:rPr><w:b/><w:bCs/></w:rPr><w:t>({cp_naissance})</w:t></w:r><w:r><w:t xml:space="preserve"> </w:t></w:r><w:r><w:t>de nationalit</w:t></w:r><w:r><w:t xml:space="preserve">é </w:t></w:r><w:r><w:t>Française</w:t></w:r><w:r><w:t xml:space="preserve"> demeurant au </w:t></w:r><w:r><w:rPr><w:b/><w:bCs/></w:rPr><w:t>{adresse}</w:t></w:r></w:p></w:tc><w:tc><w:tcPr><w:tcW w:w="1817" w:type="dxa"/><w:tcBorders><w:top w:val="single" w:sz="8" w:space="0" w:color="000000"/><w:left w:val="single" w:sz="8" w:space="0" w:color="000000"/><w:bottom w:val="single" w:sz="8" w:space="0" w:color="000000"/><w:right w:val="single" w:sz="8" w:space="0" w:color="000000"/></w:tcBorders><w:vAlign w:val="center"/></w:tcPr><w:p><w:pPr><w:pStyle w:val="EFLcellule"/></w:pPr><w:r><w:t>1</w:t></w:r><w:r><w:t>00</w:t></w:r></w:p></w:tc><w:tc><w:tcPr><w:tcW w:w="2197" w:type="dxa"/><w:tcBorders><w:top w:val="single" w:sz="8" w:space="0" w:color="000000"/><w:left w:val="single" w:sz="8" w:space="0" w:color="000000"/><w:bottom w:val="single" w:sz="8" w:space="0" w:color="000000"/><w:right w:val="single" w:sz="8" w:space="0" w:color="000000"/></w:tcBorders><w:vAlign w:val="center"/></w:tcPr><w:p><w:pPr><w:pStyle w:val="EFLcellule"/></w:pPr><w:r><w:t>1</w:t></w:r><w:r><w:t>0</w:t></w:r><w:r><w:t>0</w:t></w:r><w:r><w:t xml:space="preserve"> euro</w:t></w:r><w:r><w:t>s</w:t></w:r></w:p></w:tc><w:tc><w:tcPr><w:tcW w:w="2197" w:type="dxa"/><w:tcBorders><w:top w:val="single" w:sz="8" w:space="0" w:color="000000"/><w:left w:val="single" w:sz="8" w:space="0" w:color="000000"/><w:bottom w:val="single" w:sz="8" w:space="0" w:color="000000"/><w:right w:val="single" w:sz="8" w:space="0" w:color="000000"/></w:tcBorders><w:vAlign w:val="center"/></w:tcPr><w:p><w:pPr><w:pStyle w:val="EFLcellule"/></w:pPr><w:r><w:t>1</w:t></w:r><w:r><w:t>0</w:t></w:r><w:r><w:t>0</w:t></w:r><w:r><w:t xml:space="preserve"> euro</w:t></w:r><w:r><w:t>s</w:t></w:r></w:p></w:tc></w:tr><w:tr><w:trPr><w:trHeight w:val="1103"/></w:trPr><w:tc><w:tcPr><w:tcW w:w="3676" w:type="dxa"/><w:tcBorders><w:top w:val="single" w:sz="8" w:space="0" w:color="000000"/><w:left w:val="single" w:sz="8" w:space="0" w:color="000000"/><w:bottom w:val="single" w:sz="8" w:space="0" w:color="000000"/><w:right w:val="single" w:sz="8" w:space="0" w:color="000000"/></w:tcBorders><w:vAlign w:val="center"/></w:tcPr><w:p><w:pPr><w:pStyle w:val="EFLcellule"/><w:jc w:val="left"/></w:pPr><w:r><w:rPr><w:rStyle w:val="EFLmotgras"/></w:rPr><w:t>Total</w:t></w:r></w:p></w:tc><w:tc><w:tcPr><w:tcW w:w="1817" w:type="dxa"/><w:tcBorders><w:top w:val="single" w:sz="8" w:space="0" w:color="000000"/><w:left w:val="single" w:sz="8" w:space="0" w:color="000000"/><w:bottom w:val="single" w:sz="8" w:space="0" w:color="000000"/><w:right w:val="single" w:sz="8" w:space="0" w:color="000000"/></w:tcBorders><w:vAlign w:val="center"/></w:tcPr><w:p><w:pPr><w:pStyle w:val="EFLcellule"/></w:pPr><w:r><w:t>1</w:t></w:r><w:r><w:t>0</w:t></w:r><w:r><w:t>0</w:t></w:r></w:p></w:tc><w:tc><w:tcPr><w:tcW w:w="2197" w:type="dxa"/><w:tcBorders><w:top w:val="single" w:sz="8" w:space="0" w:color="000000"/><w:left w:val="single" w:sz="8" w:space="0" w:color="000000"/><w:bottom w:val="single" w:sz="8" w:space="0" w:color="000000"/><w:right w:val="single" w:sz="8" w:space="0" w:color="000000"/></w:tcBorders><w:vAlign w:val="center"/></w:tcPr><w:p><w:pPr><w:pStyle w:val="EFLcellule"/></w:pPr><w:r><w:t>1</w:t></w:r><w:r><w:t>0</w:t></w:r><w:r><w:t>0</w:t></w:r><w:r><w:t xml:space="preserve"> euros</w:t></w:r></w:p></w:tc><w:tc><w:tcPr><w:tcW w:w="2197" w:type="dxa"/><w:tcBorders><w:top w:val="single" w:sz="8" w:space="0" w:color="000000"/><w:left w:val="single" w:sz="8" w:space="0" w:color="000000"/><w:bottom w:val="single" w:sz="8" w:space="0" w:color="000000"/><w:right w:val="single" w:sz="8" w:space="0" w:color="000000"/></w:tcBorders><w:vAlign w:val="center"/></w:tcPr><w:p><w:pPr><w:pStyle w:val="EFLcellule"/></w:pPr><w:r><w:t xml:space="preserve"> </w:t></w:r><w:r><w:t>1</w:t></w:r><w:r><w:t>0</w:t></w:r><w:r><w:t>0</w:t></w:r><w:r><w:t xml:space="preserve"> euros</w:t></w:r></w:p></w:tc></w:tr></w:tbl><w:p><w:pPr><w:pStyle w:val="EFLtitrenotepv"/></w:pPr><w:r><w:t>ETAT DES SOUSCRIPTIONS ET DES VERSEMENTS</w:t></w:r></w:p><w:p/><w:p/><w:p><w:r><w:t xml:space="preserve">Le présent état qui constate la souscription de </w:t></w:r><w:r><w:t>1</w:t></w:r><w:r><w:t>00</w:t></w:r><w:r><w:t xml:space="preserve"> actions de la Société </w:t></w:r><w:r><w:rPr><w:b/><w:bCs/></w:rPr><w:t>{denomination}</w:t></w:r><w:r><w:rPr><w:b/><w:bCs/></w:rPr><w:t xml:space="preserve"> </w:t></w:r><w:r><w:t xml:space="preserve">ainsi que </w:t></w:r><w:r><w:t xml:space="preserve"> </w:t></w:r><w:r><w:t>le versement de la somme de</w:t></w:r><w:r><w:t xml:space="preserve"> </w:t></w:r><w:r><w:t>1</w:t></w:r><w:r><w:t>00</w:t></w:r><w:r><w:t xml:space="preserve"> euros correspondant </w:t></w:r><w:r><w:t>au</w:t></w:r><w:r><w:t xml:space="preserve"> capital libéré lors de la souscription du capital</w:t></w:r><w:r><w:t xml:space="preserve"> des</w:t></w:r><w:r><w:t xml:space="preserve"> </w:t></w:r><w:r><w:t xml:space="preserve">dites actions, est certifié exact, sincère et véritable par </w:t></w:r><w:r><w:t>le président.</w:t></w:r></w:p><w:p><w:r><w:t xml:space="preserve">Fait </w:t></w:r><w:r><w:t xml:space="preserve">à </w:t></w:r><w:r><w:rPr><w:b/><w:bCs/></w:rPr><w:t>{ville_signature}</w:t></w:r></w:p><w:p><w:r><w:t xml:space="preserve">Le </w:t></w:r><w:r><w:rPr><w:b/><w:bCs/></w:rPr><w:t>{date_signature}</w:t></w:r></w:p><w:p><w:pPr><w:rPr><w:b/><w:bCs/></w:rPr></w:pPr><w:r><w:rPr><w:b/><w:bCs/></w:rPr><w:t xml:space="preserve">{civilite} </w:t></w:r><w:r><w:rPr><w:b/><w:bCs/></w:rPr><w:t>{prenom} {nom}</w:t></w:r></w:p><w:p><w:pPr><w:ind w:left="3540"/></w:pPr></w:p><w:p/><w:p/><w:sectPr><w:pgSz w:w="11880" w:h="16840"/><w:pgMar w:top="1418" w:right="1418" w:bottom="1418" w:left="1418" w:header="709" w:footer="709" w:gutter="0"/><w:cols w:space="709"/><w:noEndnote/><w:titlePg/></w:sectPr></w:body></w:document>
+<file path=word/document.xml><?xml version="1.0" encoding="utf-8"?>
+<w:document xmlns:wpc="http://schemas.microsoft.com/office/word/2010/wordprocessingCanvas" xmlns:cx="http://schemas.microsoft.com/office/drawing/2014/chartex" xmlns:cx1="http://schemas.microsoft.com/office/drawing/2015/9/8/chartex" xmlns:cx2="http://schemas.microsoft.com/office/drawing/2015/10/21/chartex" xmlns:cx3="http://schemas.microsoft.com/office/drawing/2016/5/9/chartex" xmlns:cx4="http://schemas.microsoft.com/office/drawing/2016/5/10/chartex" xmlns:cx5="http://schemas.microsoft.com/office/drawing/2016/5/11/chartex" xmlns:cx6="http://schemas.microsoft.com/office/drawing/2016/5/12/chartex" xmlns:cx7="http://schemas.microsoft.com/office/drawing/2016/5/13/chartex" xmlns:cx8="http://schemas.microsoft.com/office/drawing/2016/5/14/chartex" xmlns:mc="http://schemas.openxmlformats.org/markup-compatibility/2006" xmlns:aink="http://schemas.microsoft.com/office/drawing/2016/ink" xmlns:am3d="http://schemas.microsoft.com/office/drawing/2017/model3d" xmlns:o="urn:schemas-microsoft-com:office:office" xmlns:oel="http://schemas.microsoft.com/office/2019/extlst" xmlns:r="http://schemas.openxmlformats.org/officeDocument/2006/relationships" xmlns:m="http://schemas.openxmlformats.org/officeDocument/2006/math" xmlns:v="urn:schemas-microsoft-com:vml" xmlns:wp14="http://schemas.microsoft.com/office/word/2010/wordprocessingDrawing" xmlns:wp="http://schemas.openxmlformats.org/drawingml/2006/wordprocessingDrawing" xmlns:w10="urn:schemas-microsoft-com:office:word" xmlns:w="http://schemas.openxmlformats.org/wordprocessingml/2006/main" xmlns:w14="http://schemas.microsoft.com/office/word/2010/wordml" xmlns:w15="http://schemas.microsoft.com/office/word/2012/wordml" xmlns:w16cex="http://schemas.microsoft.com/office/word/2018/wordml/cex" xmlns:w16cid="http://schemas.microsoft.com/office/word/2016/wordml/cid" xmlns:w16="http://schemas.microsoft.com/office/word/2018/wordml" xmlns:w16du="http://schemas.microsoft.com/office/word/2023/wordml/word16du" xmlns:w16sdtdh="http://schemas.microsoft.com/office/word/2020/wordml/sdtdatahash" xmlns:w16sdtfl="http://schemas.microsoft.com/office/word/2024/wordml/sdtformatlock" xmlns:w16se="http://schemas.microsoft.com/office/word/2015/wordml/symex" xmlns:wpg="http://schemas.microsoft.com/office/word/2010/wordprocessingGroup" xmlns:wpi="http://schemas.microsoft.com/office/word/2010/wordprocessingInk" xmlns:wne="http://schemas.microsoft.com/office/word/2006/wordml" xmlns:wps="http://schemas.microsoft.com/office/word/2010/wordprocessingShape" mc:Ignorable="w14 w15 w16se w16cid w16 w16cex w16sdtdh w16sdtfl w16du wp14">
+  <w:body>
+    <w:p>
+      <w:pPr>
+        <w:pStyle w:val="En-teteSteActe3"/>
+        <w:rPr>
+          <w:szCs w:val="22"/>
+        </w:rPr>
+      </w:pPr>
+      <w:r>
+        <w:rPr>
+          <w:szCs w:val="22"/>
+        </w:rPr>
+        <w:t xml:space="preserve">S.A.S.U </w:t>
+      </w:r>
+      <w:r>
+        <w:rPr>
+          <w:szCs w:val="22"/>
+        </w:rPr>
+        <w:t>{denomination}</w:t>
+      </w:r>
+      <w:r>
+        <w:rPr>
+          <w:szCs w:val="22"/>
+        </w:rPr>
+        <w:t xml:space="preserve"> </w:t>
+      </w:r>
+      <w:r>
+        <w:rPr>
+          <w:szCs w:val="22"/>
+        </w:rPr>
+        <w:t xml:space="preserve"> </w:t>
+      </w:r>
+    </w:p>
+    <w:p>
+      <w:pPr>
+        <w:pStyle w:val="En-teteSteActe3"/>
+        <w:rPr>
+          <w:szCs w:val="22"/>
+        </w:rPr>
+      </w:pPr>
+      <w:r>
+        <w:rPr>
+          <w:szCs w:val="22"/>
+        </w:rPr>
+        <w:t xml:space="preserve">au capital de </w:t>
+      </w:r>
+      <w:r>
+        <w:rPr>
+          <w:szCs w:val="22"/>
+        </w:rPr>
+        <w:t>{capital} Euros</w:t>
+      </w:r>
+    </w:p>
+    <w:p>
+      <w:pPr>
+        <w:pStyle w:val="En-teteSteActe3"/>
+        <w:rPr>
+          <w:sz w:val="24"/>
+          <w:szCs w:val="24"/>
+        </w:rPr>
+      </w:pPr>
+      <w:r>
+        <w:rPr>
+          <w:szCs w:val="22"/>
+        </w:rPr>
+        <w:t xml:space="preserve">Siège social : </w:t>
+      </w:r>
+      <w:bookmarkStart w:id="0" w:name="_Hlk120783997"/>
+      <w:r>
+        <w:rPr>
+          <w:sz w:val="24"/>
+          <w:szCs w:val="24"/>
+        </w:rPr>
+        <w:t>{siege_social}</w:t>
+      </w:r>
+    </w:p>
+    <w:bookmarkEnd w:id="0"/>
+    <w:p>
+      <w:pPr>
+        <w:pStyle w:val="En-teteSteActe3"/>
+      </w:pPr>
+      <w:r>
+        <w:t>Société en cours de constitution</w:t>
+      </w:r>
+    </w:p>
+    <w:tbl>
+      <w:tblPr>
+        <w:tblpPr w:leftFromText="141" w:rightFromText="141" w:vertAnchor="text" w:horzAnchor="margin" w:tblpXSpec="center" w:tblpY="2244"/>
+        <w:tblW w:w="9887" w:type="dxa"/>
+        <w:tblBorders>
+          <w:top w:val="single" w:sz="8" w:space="0" w:color="auto"/>
+          <w:left w:val="single" w:sz="8" w:space="0" w:color="auto"/>
+          <w:bottom w:val="single" w:sz="8" w:space="0" w:color="auto"/>
+          <w:right w:val="single" w:sz="8" w:space="0" w:color="auto"/>
+        </w:tblBorders>
+        <w:tblLayout w:type="fixed"/>
+        <w:tblLook w:val="04A0" w:firstRow="1" w:lastRow="0" w:firstColumn="1" w:lastColumn="0" w:noHBand="0" w:noVBand="1"/>
+      </w:tblPr>
+      <w:tblGrid>
+        <w:gridCol w:w="3676"/>
+        <w:gridCol w:w="1817"/>
+        <w:gridCol w:w="2197"/>
+        <w:gridCol w:w="2197"/>
+      </w:tblGrid>
+      <w:tr>
+        <w:trPr>
+          <w:trHeight w:val="973"/>
+          <w:tblHeader/>
+        </w:trPr>
+        <w:tc>
+          <w:tcPr>
+            <w:tcW w:w="3676" w:type="dxa"/>
+            <w:tcBorders>
+              <w:top w:val="single" w:sz="8" w:space="0" w:color="000000"/>
+              <w:left w:val="single" w:sz="8" w:space="0" w:color="000000"/>
+              <w:bottom w:val="single" w:sz="8" w:space="0" w:color="000000"/>
+              <w:right w:val="single" w:sz="8" w:space="0" w:color="000000"/>
+            </w:tcBorders>
+            <w:vAlign w:val="center"/>
+          </w:tcPr>
+          <w:p>
+            <w:pPr>
+              <w:pStyle w:val="EFLcellule"/>
+              <w:jc w:val="left"/>
+            </w:pPr>
+            <w:r>
+              <w:rPr>
+                <w:rStyle w:val="EFLmotgras"/>
+              </w:rPr>
+              <w:t>Identité ou désignation des Souscripteurs</w:t>
+            </w:r>
+          </w:p>
+        </w:tc>
+        <w:tc>
+          <w:tcPr>
+            <w:tcW w:w="1817" w:type="dxa"/>
+            <w:tcBorders>
+              <w:top w:val="single" w:sz="8" w:space="0" w:color="000000"/>
+              <w:left w:val="single" w:sz="8" w:space="0" w:color="000000"/>
+              <w:bottom w:val="single" w:sz="8" w:space="0" w:color="000000"/>
+              <w:right w:val="single" w:sz="8" w:space="0" w:color="000000"/>
+            </w:tcBorders>
+            <w:vAlign w:val="center"/>
+          </w:tcPr>
+          <w:p>
+            <w:pPr>
+              <w:pStyle w:val="EFLcellule"/>
+            </w:pPr>
+            <w:r>
+              <w:rPr>
+                <w:rStyle w:val="EFLmotgras"/>
+              </w:rPr>
+              <w:t>Nombre d'actions souscrites</w:t>
+            </w:r>
+          </w:p>
+        </w:tc>
+        <w:tc>
+          <w:tcPr>
+            <w:tcW w:w="2197" w:type="dxa"/>
+            <w:tcBorders>
+              <w:top w:val="single" w:sz="8" w:space="0" w:color="000000"/>
+              <w:left w:val="single" w:sz="8" w:space="0" w:color="000000"/>
+              <w:bottom w:val="single" w:sz="8" w:space="0" w:color="000000"/>
+              <w:right w:val="single" w:sz="8" w:space="0" w:color="000000"/>
+            </w:tcBorders>
+            <w:vAlign w:val="center"/>
+          </w:tcPr>
+          <w:p>
+            <w:pPr>
+              <w:pStyle w:val="EFLcellule"/>
+            </w:pPr>
+            <w:r>
+              <w:rPr>
+                <w:rStyle w:val="EFLmotgras"/>
+              </w:rPr>
+              <w:t>Montant des souscriptions</w:t>
+            </w:r>
+          </w:p>
+        </w:tc>
+        <w:tc>
+          <w:tcPr>
+            <w:tcW w:w="2197" w:type="dxa"/>
+            <w:tcBorders>
+              <w:top w:val="single" w:sz="8" w:space="0" w:color="000000"/>
+              <w:left w:val="single" w:sz="8" w:space="0" w:color="000000"/>
+              <w:bottom w:val="single" w:sz="8" w:space="0" w:color="000000"/>
+              <w:right w:val="single" w:sz="8" w:space="0" w:color="000000"/>
+            </w:tcBorders>
+            <w:vAlign w:val="center"/>
+          </w:tcPr>
+          <w:p>
+            <w:pPr>
+              <w:pStyle w:val="EFLcellule"/>
+            </w:pPr>
+            <w:r>
+              <w:rPr>
+                <w:rStyle w:val="EFLmotgras"/>
+              </w:rPr>
+              <w:t xml:space="preserve">Montant des versements effectués </w:t>
+            </w:r>
+          </w:p>
+        </w:tc>
+      </w:tr>
+      <w:tr>
+        <w:trPr>
+          <w:trHeight w:val="1739"/>
+        </w:trPr>
+        <w:tc>
+          <w:tcPr>
+            <w:tcW w:w="3676" w:type="dxa"/>
+            <w:tcBorders>
+              <w:top w:val="single" w:sz="8" w:space="0" w:color="000000"/>
+              <w:left w:val="single" w:sz="8" w:space="0" w:color="000000"/>
+              <w:bottom w:val="single" w:sz="8" w:space="0" w:color="000000"/>
+              <w:right w:val="single" w:sz="8" w:space="0" w:color="000000"/>
+            </w:tcBorders>
+            <w:vAlign w:val="center"/>
+          </w:tcPr>
+          <w:p>
+            <w:pPr>
+              <w:rPr>
+                <w:b/>
+                <w:bCs/>
+              </w:rPr>
+            </w:pPr>
+            <w:r>
+              <w:rPr>
+                <w:b/>
+                <w:bCs/>
+              </w:rPr>
+              <w:t xml:space="preserve">{civilite} </w:t>
+            </w:r>
+            <w:r>
+              <w:rPr>
+                <w:b/>
+                <w:bCs/>
+              </w:rPr>
+              <w:t xml:space="preserve">{prenom} {nom} </w:t>
+            </w:r>
+            <w:r>
+              <w:t>n</w:t>
+            </w:r>
+            <w:r>
+              <w:t xml:space="preserve">é le </w:t>
+            </w:r>
+            <w:r>
+              <w:rPr>
+                <w:b/>
+                <w:bCs/>
+              </w:rPr>
+              <w:t>{date_naissance}</w:t>
+            </w:r>
+            <w:r>
+              <w:t xml:space="preserve"> à</w:t>
+            </w:r>
+            <w:r>
+              <w:t xml:space="preserve"> </w:t>
+            </w:r>
+            <w:r>
+              <w:rPr>
+                <w:b/>
+                <w:bCs/>
+              </w:rPr>
+              <w:t>{ville_naissance}</w:t>
+            </w:r>
+            <w:r>
+              <w:rPr>
+                <w:b/>
+                <w:bCs/>
+              </w:rPr>
+              <w:t xml:space="preserve"> </w:t>
+            </w:r>
+            <w:r>
+              <w:rPr>
+                <w:b/>
+                <w:bCs/>
+              </w:rPr>
+              <w:t>({cp_naissance})</w:t>
+            </w:r>
+            <w:r>
+              <w:t xml:space="preserve"> </w:t>
+            </w:r>
+            <w:r>
+              <w:t>de nationalit</w:t>
+            </w:r>
+            <w:r>
+              <w:t xml:space="preserve">é </w:t>
+            </w:r>
+            <w:r>
+              <w:t>Française</w:t>
+            </w:r>
+            <w:r>
+              <w:t xml:space="preserve"> demeurant au </w:t>
+            </w:r>
+            <w:r>
+              <w:rPr>
+                <w:b/>
+                <w:bCs/>
+              </w:rPr>
+              <w:t>{adresse}</w:t>
+            </w:r>
+          </w:p>
+        </w:tc>
+        <w:tc>
+          <w:tcPr>
+            <w:tcW w:w="1817" w:type="dxa"/>
+            <w:tcBorders>
+              <w:top w:val="single" w:sz="8" w:space="0" w:color="000000"/>
+              <w:left w:val="single" w:sz="8" w:space="0" w:color="000000"/>
+              <w:bottom w:val="single" w:sz="8" w:space="0" w:color="000000"/>
+              <w:right w:val="single" w:sz="8" w:space="0" w:color="000000"/>
+            </w:tcBorders>
+            <w:vAlign w:val="center"/>
+          </w:tcPr>
+          <w:p>
+            <w:pPr>
+              <w:pStyle w:val="EFLcellule"/>
+            </w:pPr>
+            <w:r>
+              <w:t>1</w:t>
+            </w:r>
+            <w:r>
+              <w:t>00</w:t>
+            </w:r>
+          </w:p>
+        </w:tc>
+        <w:tc>
+          <w:tcPr>
+            <w:tcW w:w="2197" w:type="dxa"/>
+            <w:tcBorders>
+              <w:top w:val="single" w:sz="8" w:space="0" w:color="000000"/>
+              <w:left w:val="single" w:sz="8" w:space="0" w:color="000000"/>
+              <w:bottom w:val="single" w:sz="8" w:space="0" w:color="000000"/>
+              <w:right w:val="single" w:sz="8" w:space="0" w:color="000000"/>
+            </w:tcBorders>
+            <w:vAlign w:val="center"/>
+          </w:tcPr>
+          <w:p>
+            <w:pPr>
+              <w:pStyle w:val="EFLcellule"/>
+            </w:pPr>
+            <w:r>
+              <w:t>1</w:t>
+            </w:r>
+            <w:r>
+              <w:t>0</w:t>
+            </w:r>
+            <w:r>
+              <w:t>0</w:t>
+            </w:r>
+            <w:r>
+              <w:t xml:space="preserve"> euro</w:t>
+            </w:r>
+            <w:r>
+              <w:t>s</w:t>
+            </w:r>
+          </w:p>
+        </w:tc>
+        <w:tc>
+          <w:tcPr>
+            <w:tcW w:w="2197" w:type="dxa"/>
+            <w:tcBorders>
+              <w:top w:val="single" w:sz="8" w:space="0" w:color="000000"/>
+              <w:left w:val="single" w:sz="8" w:space="0" w:color="000000"/>
+              <w:bottom w:val="single" w:sz="8" w:space="0" w:color="000000"/>
+              <w:right w:val="single" w:sz="8" w:space="0" w:color="000000"/>
+            </w:tcBorders>
+            <w:vAlign w:val="center"/>
+          </w:tcPr>
+          <w:p>
+            <w:pPr>
+              <w:pStyle w:val="EFLcellule"/>
+            </w:pPr>
+            <w:r>
+              <w:t>1</w:t>
+            </w:r>
+            <w:r>
+              <w:t>0</w:t>
+            </w:r>
+            <w:r>
+              <w:t>0</w:t>
+            </w:r>
+            <w:r>
+              <w:t xml:space="preserve"> euro</w:t>
+            </w:r>
+            <w:r>
+              <w:t>s</w:t>
+            </w:r>
+          </w:p>
+        </w:tc>
+      </w:tr>
+      <w:tr>
+        <w:trPr>
+          <w:trHeight w:val="1103"/>
+        </w:trPr>
+        <w:tc>
+          <w:tcPr>
+            <w:tcW w:w="3676" w:type="dxa"/>
+            <w:tcBorders>
+              <w:top w:val="single" w:sz="8" w:space="0" w:color="000000"/>
+              <w:left w:val="single" w:sz="8" w:space="0" w:color="000000"/>
+              <w:bottom w:val="single" w:sz="8" w:space="0" w:color="000000"/>
+              <w:right w:val="single" w:sz="8" w:space="0" w:color="000000"/>
+            </w:tcBorders>
+            <w:vAlign w:val="center"/>
+          </w:tcPr>
+          <w:p>
+            <w:pPr>
+              <w:pStyle w:val="EFLcellule"/>
+              <w:jc w:val="left"/>
+            </w:pPr>
+            <w:r>
+              <w:rPr>
+                <w:rStyle w:val="EFLmotgras"/>
+              </w:rPr>
+              <w:t>Total</w:t>
+            </w:r>
+          </w:p>
+        </w:tc>
+        <w:tc>
+          <w:tcPr>
+            <w:tcW w:w="1817" w:type="dxa"/>
+            <w:tcBorders>
+              <w:top w:val="single" w:sz="8" w:space="0" w:color="000000"/>
+              <w:left w:val="single" w:sz="8" w:space="0" w:color="000000"/>
+              <w:bottom w:val="single" w:sz="8" w:space="0" w:color="000000"/>
+              <w:right w:val="single" w:sz="8" w:space="0" w:color="000000"/>
+            </w:tcBorders>
+            <w:vAlign w:val="center"/>
+          </w:tcPr>
+          <w:p>
+            <w:pPr>
+              <w:pStyle w:val="EFLcellule"/>
+            </w:pPr>
+            <w:r>
+              <w:t>1</w:t>
+            </w:r>
+            <w:r>
+              <w:t>0</w:t>
+            </w:r>
+            <w:r>
+              <w:t>0</w:t>
+            </w:r>
+          </w:p>
+        </w:tc>
+        <w:tc>
+          <w:tcPr>
+            <w:tcW w:w="2197" w:type="dxa"/>
+            <w:tcBorders>
+              <w:top w:val="single" w:sz="8" w:space="0" w:color="000000"/>
+              <w:left w:val="single" w:sz="8" w:space="0" w:color="000000"/>
+              <w:bottom w:val="single" w:sz="8" w:space="0" w:color="000000"/>
+              <w:right w:val="single" w:sz="8" w:space="0" w:color="000000"/>
+            </w:tcBorders>
+            <w:vAlign w:val="center"/>
+          </w:tcPr>
+          <w:p>
+            <w:pPr>
+              <w:pStyle w:val="EFLcellule"/>
+            </w:pPr>
+            <w:r>
+              <w:t>1</w:t>
+            </w:r>
+            <w:r>
+              <w:t>0</w:t>
+            </w:r>
+            <w:r>
+              <w:t>0</w:t>
+            </w:r>
+            <w:r>
+              <w:t xml:space="preserve"> euros</w:t>
+            </w:r>
+          </w:p>
+        </w:tc>
+        <w:tc>
+          <w:tcPr>
+            <w:tcW w:w="2197" w:type="dxa"/>
+            <w:tcBorders>
+              <w:top w:val="single" w:sz="8" w:space="0" w:color="000000"/>
+              <w:left w:val="single" w:sz="8" w:space="0" w:color="000000"/>
+              <w:bottom w:val="single" w:sz="8" w:space="0" w:color="000000"/>
+              <w:right w:val="single" w:sz="8" w:space="0" w:color="000000"/>
+            </w:tcBorders>
+            <w:vAlign w:val="center"/>
+          </w:tcPr>
+          <w:p>
+            <w:pPr>
+              <w:pStyle w:val="EFLcellule"/>
+            </w:pPr>
+            <w:r>
+              <w:t xml:space="preserve"> </w:t>
+            </w:r>
+            <w:r>
+              <w:t>1</w:t>
+            </w:r>
+            <w:r>
+              <w:t>0</w:t>
+            </w:r>
+            <w:r>
+              <w:t>0</w:t>
+            </w:r>
+            <w:r>
+              <w:t xml:space="preserve"> euros</w:t>
+            </w:r>
+          </w:p>
+        </w:tc>
+      </w:tr>
+    </w:tbl>
+    <w:p>
+      <w:pPr>
+        <w:pStyle w:val="EFLtitrenotepv"/>
+      </w:pPr>
+      <w:r>
+        <w:t>ETAT DES SOUSCRIPTIONS ET DES VERSEMENTS</w:t>
+      </w:r>
+    </w:p>
+    <w:p/>
+    <w:p/>
+    <w:p>
+      <w:r>
+        <w:t xml:space="preserve">Le présent état qui constate la souscription de </w:t>
+      </w:r>
+      <w:r>
+        <w:t>1</w:t>
+      </w:r>
+      <w:r>
+        <w:t>00</w:t>
+      </w:r>
+      <w:r>
+        <w:t xml:space="preserve"> actions de la Société </w:t>
+      </w:r>
+      <w:r>
+        <w:rPr>
+          <w:b/>
+          <w:bCs/>
+        </w:rPr>
+        <w:t>{denomination}</w:t>
+      </w:r>
+      <w:r>
+        <w:rPr>
+          <w:b/>
+          <w:bCs/>
+        </w:rPr>
+        <w:t xml:space="preserve"> </w:t>
+      </w:r>
+      <w:r>
+        <w:t xml:space="preserve">ainsi que </w:t>
+      </w:r>
+      <w:r>
+        <w:t xml:space="preserve"> </w:t>
+      </w:r>
+      <w:r>
+        <w:t>le versement de la somme de</w:t>
+      </w:r>
+      <w:r>
+        <w:t xml:space="preserve"> </w:t>
+      </w:r>
+      <w:r>
+        <w:t>1</w:t>
+      </w:r>
+      <w:r>
+        <w:t>00</w:t>
+      </w:r>
+      <w:r>
+        <w:t xml:space="preserve"> euros correspondant </w:t>
+      </w:r>
+      <w:r>
+        <w:t>au</w:t>
+      </w:r>
+      <w:r>
+        <w:t xml:space="preserve"> capital libéré lors de la souscription du capital</w:t>
+      </w:r>
+      <w:r>
+        <w:t xml:space="preserve"> des</w:t>
+      </w:r>
+      <w:r>
+        <w:t xml:space="preserve"> </w:t>
+      </w:r>
+      <w:r>
+        <w:t xml:space="preserve">dites actions, est certifié exact, sincère et véritable par </w:t>
+      </w:r>
+      <w:r>
+        <w:t>le président.</w:t>
+      </w:r>
+    </w:p>
+    <w:p>
+      <w:r>
+        <w:t xml:space="preserve">Fait </w:t>
+      </w:r>
+      <w:r>
+        <w:t xml:space="preserve">à </w:t>
+      </w:r>
+      <w:r>
+        <w:rPr>
+          <w:b/>
+          <w:bCs/>
+        </w:rPr>
+        <w:t>{ville_signature}</w:t>
+      </w:r>
+    </w:p>
+    <w:p>
+      <w:r>
+        <w:t xml:space="preserve">Le </w:t>
+      </w:r>
+      <w:r>
+        <w:rPr>
+          <w:b/>
+          <w:bCs/>
+        </w:rPr>
+        <w:t>{date_signature}</w:t>
+      </w:r>
+    </w:p>
+    <w:p>
+      <w:pPr>
+        <w:rPr>
+          <w:b/>
+          <w:bCs/>
+        </w:rPr>
+      </w:pPr>
+      <w:r>
+        <w:rPr>
+          <w:b/>
+          <w:bCs/>
+        </w:rPr>
+        <w:t xml:space="preserve">{civilite} </w:t>
+      </w:r>
+      <w:r>
+        <w:rPr>
+          <w:b/>
+          <w:bCs/>
+        </w:rPr>
+        <w:t>{prenom} {nom}</w:t>
+      </w:r>
+    </w:p>
+    <w:p>
+      <w:pPr>
+        <w:ind w:left="3540"/>
+      </w:pPr>
+    </w:p>
+    <w:p/>
+    <w:p/>
+    <w:sectPr>
+      <w:pgSz w:w="11880" w:h="16840"/>
+      <w:pgMar w:top="1418" w:right="1418" w:bottom="1418" w:left="1418" w:header="709" w:footer="709" w:gutter="0"/>
+      <w:cols w:space="709"/>
+      <w:noEndnote/>
+      <w:titlePg/>
+    </w:sectPr>
+  </w:body>
+</w:document>
 </file>
 
 <file path=word/endnotes.xml><?xml version="1.0" encoding="utf-8"?>

</xml_diff>